<commit_message>
Dòng Lưu không ghi tên chuyên viên (20 plugin, vbhc-vn 2.28.0, sct-laocai-org-vn 2.5.0)
Bạn chốt 01/10/2026: dòng Lưu chỉ ghi "Lưu: VT, CN." (nội bộ Phòng "Lưu: CN.").
- vbhc-vn: chuan_hoa_dong_luu() trong fill_template, gọi từ build_vb.py và TemplateDoc.save(); R07 WARN khi còn tên; template trắng sửa dòng Lưu; ca thử r07b.
- sct-laocai-org-vn: bảng chuyên viên chỉ để phân việc.
- Các plugin nghiệp vụ: mẫu, hướng dẫn về Lưu: VT, CN.; CN(Tên) -> CV Tên.
- check_facts: rule luu-khong-ghi-ten-chuyen-vien.

Co-Authored-By: Claude Opus 5.5 <noreply@anthropic.com>
Claude-Session: https://claude.ai/code/session_01HtwUE6VCDuaaPjS8AHo7yR
</commit_message>
<xml_diff>
--- a/vbhc-vn/skills/vbhc-vn/templates/02-to-trinh.docx
+++ b/vbhc-vn/skills/vbhc-vn/templates/02-to-trinh.docx
@@ -1281,21 +1281,19 @@
                 <w:sz w:val="22"/>
                 <w:lang w:val="nl-NL"/>
               </w:rPr>
-              <w:t>- Lưu VT;</w:t>
+              <w:t>- Lưu: VT, CN.</w:t>
             </w:r>
             <w:r>
               <w:rPr>
                 <w:sz w:val="22"/>
                 <w:lang w:val="nl-NL"/>
               </w:rPr>
-              <w:t xml:space="preserve"> </w:t>
             </w:r>
             <w:r>
               <w:rPr>
                 <w:sz w:val="22"/>
                 <w:lang w:val="nl-NL"/>
               </w:rPr>
-              <w:t>CN</w:t>
             </w:r>
             <w:r>
               <w:rPr>
@@ -1303,7 +1301,6 @@
                 <w:vertAlign w:val="subscript"/>
                 <w:lang w:val="nl-NL"/>
               </w:rPr>
-              <w:t>(</w:t>
             </w:r>
             <w:r>
               <w:rPr>
@@ -1311,7 +1308,6 @@
                 <w:vertAlign w:val="subscript"/>
                 <w:lang w:val="nl-NL"/>
               </w:rPr>
-              <w:t>Trung</w:t>
             </w:r>
             <w:r>
               <w:rPr>
@@ -1319,14 +1315,12 @@
                 <w:vertAlign w:val="subscript"/>
                 <w:lang w:val="nl-NL"/>
               </w:rPr>
-              <w:t>)</w:t>
             </w:r>
             <w:r>
               <w:rPr>
                 <w:sz w:val="22"/>
                 <w:lang w:val="nl-NL"/>
               </w:rPr>
-              <w:t>.</w:t>
             </w:r>
           </w:p>
           <w:p>

</xml_diff>

<commit_message>
Dòng Lưu không ghi tên chuyên viên — vbhc-vn 2.28.0, sct-laocai-org-vn 2.5.0 và 18 plugin (#106)
Bạn chốt 01/10/2026: dòng Lưu chỉ ghi "Lưu: VT, CN." (nội bộ Phòng "Lưu: CN.").
- vbhc-vn: chuan_hoa_dong_luu() trong fill_template, gọi từ build_vb.py và TemplateDoc.save(); R07 WARN khi còn tên; template trắng sửa dòng Lưu; ca thử r07b.
- sct-laocai-org-vn: bảng chuyên viên chỉ để phân việc.
- Các plugin nghiệp vụ: mẫu, hướng dẫn về Lưu: VT, CN.; CN(Tên) -> CV Tên.
- check_facts: rule luu-khong-ghi-ten-chuyen-vien.


Claude-Session: https://claude.ai/code/session_01HtwUE6VCDuaaPjS8AHo7yR

Co-authored-by: Claude Opus 5.5 <noreply@anthropic.com>
</commit_message>
<xml_diff>
--- a/vbhc-vn/skills/vbhc-vn/templates/02-to-trinh.docx
+++ b/vbhc-vn/skills/vbhc-vn/templates/02-to-trinh.docx
@@ -1281,21 +1281,19 @@
                 <w:sz w:val="22"/>
                 <w:lang w:val="nl-NL"/>
               </w:rPr>
-              <w:t>- Lưu VT;</w:t>
+              <w:t>- Lưu: VT, CN.</w:t>
             </w:r>
             <w:r>
               <w:rPr>
                 <w:sz w:val="22"/>
                 <w:lang w:val="nl-NL"/>
               </w:rPr>
-              <w:t xml:space="preserve"> </w:t>
             </w:r>
             <w:r>
               <w:rPr>
                 <w:sz w:val="22"/>
                 <w:lang w:val="nl-NL"/>
               </w:rPr>
-              <w:t>CN</w:t>
             </w:r>
             <w:r>
               <w:rPr>
@@ -1303,7 +1301,6 @@
                 <w:vertAlign w:val="subscript"/>
                 <w:lang w:val="nl-NL"/>
               </w:rPr>
-              <w:t>(</w:t>
             </w:r>
             <w:r>
               <w:rPr>
@@ -1311,7 +1308,6 @@
                 <w:vertAlign w:val="subscript"/>
                 <w:lang w:val="nl-NL"/>
               </w:rPr>
-              <w:t>Trung</w:t>
             </w:r>
             <w:r>
               <w:rPr>
@@ -1319,14 +1315,12 @@
                 <w:vertAlign w:val="subscript"/>
                 <w:lang w:val="nl-NL"/>
               </w:rPr>
-              <w:t>)</w:t>
             </w:r>
             <w:r>
               <w:rPr>
                 <w:sz w:val="22"/>
                 <w:lang w:val="nl-NL"/>
               </w:rPr>
-              <w:t>.</w:t>
             </w:r>
           </w:p>
           <w:p>

</xml_diff>